<commit_message>
F4: versiona CSV original y cierra documentación F1-F4
</commit_message>
<xml_diff>
--- a/F4/f4_s04_grupo2.docx
+++ b/F4/f4_s04_grupo2.docx
@@ -1092,7 +1092,7 @@
           <w:rFonts w:ascii="Arial" w:hAnsi="Arial"/>
           <w:sz w:val="20"/>
         </w:rPr>
-        <w:t>Docente: Dr. Omar Salinas Silva</w:t>
+        <w:t>Docente: Dr. Omar Iván Salinas Silva</w:t>
       </w:r>
     </w:p>
     <w:p>
@@ -2734,7 +2734,6 @@
           <w:sz w:val="22"/>
           <w:szCs w:val="24"/>
         </w:rPr>
-        <w:t>(campos vacíos)</w:t>
       </w:r>
       <w:r>
         <w:rPr>
@@ -2804,7 +2803,7 @@
           <w:rFonts w:ascii="Arial" w:hAnsi="Arial" w:cs="Arial"/>
           <w:sz w:val="22"/>
         </w:rPr>
-        <w:t>CSV original → F1 y F2 → CSV preparado → funciones y clases de F3 → notebook F4 → tablas y figuras. F3 separa lectura, cálculo y medición en módulos; AnalizadorNacimientos reúne la carga y dos implementaciones del indicador. EstrategiaTalla define una interfaz común que las cuatro clases implementan; el comparador aprovecha polimorfismo para evaluar alternativas. Una función recursiva se reserva para aplanar metadatos anidados, donde la estructura del problema la justifica, en vez de recorrer 735.611 filas de forma recursiva (Universidad Andrés Bello, 2026a).</w:t>
+        <w:t xml:space="preserve"> CSV original → F1 y F2 → CSV preparado → funciones y clases de F3 → notebook F4 → tablas y figuras. F3 separa lectura, cálculo y medición en módulos; AnalizadorNacimientos reúne la carga y dos implementaciones del indicador. EstrategiaTalla define una interfaz común que las cuatro clases implementan; el comparador aprovecha polimorfismo para evaluar alternativas. Una función recursiva se reserva para aplanar metadatos anidados, donde la estructura del problema la justifica, en vez de recorrer 735.611 filas de forma recursiva (Universidad Andrés Bello, 2026a).</w:t>
       </w:r>
     </w:p>
     <w:p>
@@ -2852,7 +2851,7 @@
           <w:rFonts w:ascii="Arial" w:hAnsi="Arial" w:cs="Arial"/>
           <w:sz w:val="22"/>
         </w:rPr>
-        <w:t>El entorno utiliza Python 3.13.5 y las versiones fijadas en requirements.txt; F4 añade SciPy 1.18.1 para intervalos y pruebas. La primera celda detiene la ejecución si el kernel difiere de esas versiones. El equipo puede reconstruir la salida colocando el CSV original en data/raw, ejecutando F1 y F2 y luego F3 y F4 con “Restart &amp; Run All”. El notebook F4 verificó versiones, huella del original, filas, categorías y equivalencia del indicador y de la mediana regional con F3.</w:t>
+        <w:t>Las ejecuciones registradas utilizaron Python 3.13 y las versiones fijadas en requirements.txt; F4 añade SciPy 1.18.1 para intervalos y pruebas. La primera celda detiene la ejecución si el kernel difiere de esas versiones. El equipo puede reconstruir la salida a partir del CSV original versionado en data/raw, ejecutando F1 y F2 y luego F3 y F4 con “Restart &amp; Run All”. El notebook F4 verificó versiones, huella del original, filas, categorías y equivalencia del indicador y de la mediana regional con F3.</w:t>
       </w:r>
     </w:p>
     <w:p>
@@ -3797,7 +3796,7 @@
           <w:sz w:val="22"/>
           <w:szCs w:val="24"/>
         </w:rPr>
-        <w:t>Las observaciones docentes anteriores llevaron a fijar versiones, aclarar los entregables de F3 y retirar archivos residuales. F4/changelog.md registra las fechas, los commits verificables y el motivo técnico. Los aportes de Cristian, Jorge, Renzo y Luis a F3 constan en el historial; F4 se mantiene en una rama separada para revisión del equipo.</w:t>
+        <w:t>Las observaciones docentes anteriores llevaron a fijar versiones, aclarar los entregables de F3 y retirar archivos residuales. F4/changelog.md registra las fechas, los commits verificables y el motivo técnico. Los aportes de Cristian, Jorge, Renzo y Luis a F3 constan en el historial. F4 se integró en main mediante el PR #9; las revisiones posteriores del informe y la presentación constan en el historial.</w:t>
       </w:r>
     </w:p>
     <w:tbl>
@@ -4124,20 +4123,8 @@
             <w:vAlign w:val="center"/>
           </w:tcPr>
           <w:p>
-            <w:pPr>
-              <w:rPr>
-                <w:rFonts w:ascii="Arial" w:hAnsi="Arial" w:cs="Arial"/>
-                <w:sz w:val="22"/>
-                <w:szCs w:val="24"/>
-              </w:rPr>
-            </w:pPr>
             <w:r>
-              <w:rPr>
-                <w:rFonts w:ascii="Arial" w:hAnsi="Arial" w:cs="Arial"/>
-                <w:sz w:val="22"/>
-                <w:szCs w:val="24"/>
-              </w:rPr>
-              <w:t>Resultados finales por comunicar</w:t>
+              <w:t>Resultados finales comunicados</w:t>
             </w:r>
           </w:p>
         </w:tc>
@@ -4170,30 +4157,8 @@
             <w:vAlign w:val="center"/>
           </w:tcPr>
           <w:p>
-            <w:pPr>
-              <w:rPr>
-                <w:rFonts w:ascii="Arial" w:hAnsi="Arial" w:cs="Arial"/>
-                <w:sz w:val="22"/>
-                <w:szCs w:val="24"/>
-                <w:lang w:val="en-US"/>
-              </w:rPr>
-            </w:pPr>
             <w:r>
-              <w:rPr>
-                <w:rFonts w:ascii="Arial" w:hAnsi="Arial" w:cs="Arial"/>
-                <w:sz w:val="22"/>
-                <w:szCs w:val="24"/>
-                <w:lang w:val="en-US"/>
-              </w:rPr>
-              <w:t xml:space="preserve">Notebook F4; commit </w:t>
-            </w:r>
-            <w:r>
-              <w:rPr>
-                <w:rFonts w:ascii="Arial" w:hAnsi="Arial" w:cs="Arial"/>
-                <w:sz w:val="22"/>
-                <w:szCs w:val="24"/>
-              </w:rPr>
-              <w:t>tras revisión</w:t>
+              <w:t>Notebook F4; PR #9 y revisión documental bf7e46e</w:t>
             </w:r>
           </w:p>
         </w:tc>
@@ -4218,7 +4183,7 @@
         <w:rPr>
           <w:rFonts w:ascii="Arial" w:hAnsi="Arial" w:cs="Arial"/>
         </w:rPr>
-        <w:t>Como reflexión técnica, separar preparación, cálculo y comunicación permitió verificar F4 sin rehacer F2 ni copiar las clases de F3. La lectura selectiva usó menos memoria del DataFrame y groupby redujo el tiempo medido, aunque ambas cifras dependen del equipo. Mantener el CSV fuera de GitHub exige una URL y una huella precisas. Falta comprobar el flujo completo en otro computador; para estudiar tendencias causales también harían falta más años y otras variables.</w:t>
+        <w:t>Como reflexión técnica, separar preparación, cálculo y comunicación permitió verificar F4 sin rehacer F2 ni copiar las clases de F3. La lectura selectiva usó menos memoria del DataFrame y groupby redujo el tiempo medido, aunque ambas cifras dependen del equipo. Versionar el CSV original con su huella permite reconstruir los resultados desde una copia nueva. Renzo confirmó la ejecución cruzada; para estudiar tendencias causales también harían falta más años y otras variables.</w:t>
       </w:r>
     </w:p>
     <w:p>

</xml_diff>